<commit_message>
reviwed and added to peer review
</commit_message>
<xml_diff>
--- a/Peer Review Document/PeerReviewTeam32IN2033_2026 v1.docx
+++ b/Peer Review Document/PeerReviewTeam32IN2033_2026 v1.docx
@@ -346,7 +346,7 @@
               <w:rPr>
                 <w:noProof/>
               </w:rPr>
-              <w:t>04/03/2026</w:t>
+              <w:t>05/03/2026</w:t>
             </w:r>
             <w:r>
               <w:fldChar w:fldCharType="end"/>
@@ -512,8 +512,13 @@
             <w:tcW w:w="4304" w:type="dxa"/>
           </w:tcPr>
           <w:p>
-            <w:r>
-              <w:t xml:space="preserve">Sukhmanvir Atwal </w:t>
+            <w:proofErr w:type="spellStart"/>
+            <w:r>
+              <w:t>Sukhmanvir</w:t>
+            </w:r>
+            <w:proofErr w:type="spellEnd"/>
+            <w:r>
+              <w:t xml:space="preserve"> Atwal </w:t>
             </w:r>
             <w:r>
               <w:t>(</w:t>
@@ -566,13 +571,27 @@
           <w:tcPr>
             <w:tcW w:w="1271" w:type="dxa"/>
           </w:tcPr>
-          <w:p/>
+          <w:p>
+            <w:pPr>
+              <w:jc w:val="center"/>
+            </w:pPr>
+            <w:r>
+              <w:t>Y</w:t>
+            </w:r>
+          </w:p>
         </w:tc>
         <w:tc>
           <w:tcPr>
             <w:tcW w:w="3441" w:type="dxa"/>
           </w:tcPr>
-          <w:p/>
+          <w:p>
+            <w:r>
+              <w:t>4</w:t>
+            </w:r>
+            <w:r>
+              <w:t>5Minutes</w:t>
+            </w:r>
+          </w:p>
         </w:tc>
       </w:tr>
       <w:tr>
@@ -581,11 +600,16 @@
             <w:tcW w:w="4304" w:type="dxa"/>
           </w:tcPr>
           <w:p>
-            <w:r>
-              <w:t>Viktor Vasilchin</w:t>
-            </w:r>
-            <w:r>
-              <w:t xml:space="preserve"> (System Analyst / Designer)</w:t>
+            <w:pPr>
+              <w:rPr>
+                <w:lang w:val="de-DE"/>
+              </w:rPr>
+            </w:pPr>
+            <w:r>
+              <w:rPr>
+                <w:lang w:val="de-DE"/>
+              </w:rPr>
+              <w:t>Viktor Vasilchin (System Analyst / Designer)</w:t>
             </w:r>
           </w:p>
         </w:tc>
@@ -594,6 +618,9 @@
             <w:tcW w:w="1271" w:type="dxa"/>
           </w:tcPr>
           <w:p>
+            <w:pPr>
+              <w:jc w:val="center"/>
+            </w:pPr>
             <w:r>
               <w:t>Y</w:t>
             </w:r>
@@ -864,7 +891,7 @@
           </w:tcPr>
           <w:p>
             <w:r>
-              <w:t>Software Architecture</w:t>
+              <w:t>High Level Design</w:t>
             </w:r>
           </w:p>
           <w:p>
@@ -889,7 +916,7 @@
           </w:tcPr>
           <w:p>
             <w:r>
-              <w:t xml:space="preserve">Inconsistency between our team’s component diagram and theirs coming from the OnlineOrderAPI </w:t>
+              <w:t>Inconsistency between team’s component diagram</w:t>
             </w:r>
           </w:p>
         </w:tc>
@@ -899,7 +926,18 @@
           </w:tcPr>
           <w:p>
             <w:r>
-              <w:t>Removing the OnlineOrderAPI entirely as it is not needed since OrderAPI covers everything the system would need.</w:t>
+              <w:t xml:space="preserve">Remove additional </w:t>
+            </w:r>
+            <w:proofErr w:type="spellStart"/>
+            <w:r>
+              <w:t>onlineOrderAPI</w:t>
+            </w:r>
+            <w:proofErr w:type="spellEnd"/>
+            <w:r>
+              <w:t xml:space="preserve"> interface, which is not necessarily required </w:t>
+            </w:r>
+            <w:r>
+              <w:t>.</w:t>
             </w:r>
           </w:p>
         </w:tc>
@@ -921,7 +959,7 @@
           </w:tcPr>
           <w:p>
             <w:r>
-              <w:t>Software Architecture</w:t>
+              <w:t>High Level Design</w:t>
             </w:r>
           </w:p>
           <w:p>
@@ -936,7 +974,7 @@
           </w:tcPr>
           <w:p>
             <w:r>
-              <w:t>Viktor</w:t>
+              <w:t>Jagdish</w:t>
             </w:r>
           </w:p>
         </w:tc>
@@ -946,7 +984,18 @@
           </w:tcPr>
           <w:p>
             <w:r>
-              <w:t>No note explaining OnlineOrderAPI</w:t>
+              <w:t xml:space="preserve">No note explaining </w:t>
+            </w:r>
+            <w:r>
+              <w:t xml:space="preserve">additional </w:t>
+            </w:r>
+            <w:proofErr w:type="spellStart"/>
+            <w:r>
+              <w:t>OnlineOrderAPI</w:t>
+            </w:r>
+            <w:proofErr w:type="spellEnd"/>
+            <w:r>
+              <w:t xml:space="preserve"> in component or class diagram.</w:t>
             </w:r>
           </w:p>
         </w:tc>
@@ -956,7 +1005,15 @@
           </w:tcPr>
           <w:p>
             <w:r>
-              <w:t>Considering the fact the already is an API which is to do with ordering, and they’ve added an extra one, a note explaining the difference is needed because as of right now there is no clear difference between the two APIs</w:t>
+              <w:t xml:space="preserve">Add a comment/note which explains the extra addition of the </w:t>
+            </w:r>
+            <w:proofErr w:type="spellStart"/>
+            <w:r>
+              <w:t>onlineOrderAPI</w:t>
+            </w:r>
+            <w:proofErr w:type="spellEnd"/>
+            <w:r>
+              <w:t xml:space="preserve"> interface and why it may be needed.</w:t>
             </w:r>
           </w:p>
         </w:tc>
@@ -1002,8 +1059,13 @@
             <w:tcW w:w="1704" w:type="dxa"/>
           </w:tcPr>
           <w:p>
-            <w:r>
-              <w:t>sendEmail API has a parameter  “to”</w:t>
+            <w:proofErr w:type="spellStart"/>
+            <w:r>
+              <w:t>sendEmail</w:t>
+            </w:r>
+            <w:proofErr w:type="spellEnd"/>
+            <w:r>
+              <w:t xml:space="preserve"> API has a parameter  “to”</w:t>
             </w:r>
           </w:p>
         </w:tc>
@@ -1075,8 +1137,13 @@
             <w:r>
               <w:t xml:space="preserve">Inconsistency from </w:t>
             </w:r>
-            <w:r>
-              <w:t xml:space="preserve">PaymentAPI parameter “amount” </w:t>
+            <w:proofErr w:type="spellStart"/>
+            <w:r>
+              <w:t>PaymentAPI</w:t>
+            </w:r>
+            <w:proofErr w:type="spellEnd"/>
+            <w:r>
+              <w:t xml:space="preserve"> parameter “amount” </w:t>
             </w:r>
             <w:r>
               <w:t>data type between class diagram and test table</w:t>
@@ -1089,10 +1156,18 @@
           </w:tcPr>
           <w:p>
             <w:r>
-              <w:t>It is int in the class diagram but double in the test table.</w:t>
-            </w:r>
-            <w:r>
-              <w:t>This will cause an error if the price of an item contains a decimal part, better to be double instead of int.</w:t>
+              <w:t xml:space="preserve">It is int in the class diagram but double in the test </w:t>
+            </w:r>
+            <w:proofErr w:type="spellStart"/>
+            <w:r>
+              <w:t>table.</w:t>
+            </w:r>
+            <w:r>
+              <w:t>This</w:t>
+            </w:r>
+            <w:proofErr w:type="spellEnd"/>
+            <w:r>
+              <w:t xml:space="preserve"> will cause an error if the price of an item contains a decimal part, better to be double instead of int.</w:t>
             </w:r>
           </w:p>
         </w:tc>
@@ -1187,7 +1262,6 @@
           </w:tcPr>
           <w:p>
             <w:r>
-              <w:lastRenderedPageBreak/>
               <w:t>Appropriate title, page numbering, version control</w:t>
             </w:r>
           </w:p>
@@ -1240,7 +1314,11 @@
           </w:tcPr>
           <w:p>
             <w:r>
-              <w:t xml:space="preserve">It has a clear structure, correctly defines the purpose and scope of the subsystem, identifies the intended audience, and distinguishes IPOS-PU from the other subsystems, which shows a solid understanding of requirements documentation. </w:t>
+              <w:t xml:space="preserve">It has a clear structure, correctly defines the purpose and scope of the subsystem, identifies the intended audience, and distinguishes IPOS-PU from </w:t>
+            </w:r>
+            <w:r>
+              <w:lastRenderedPageBreak/>
+              <w:t xml:space="preserve">the other subsystems, which shows a solid understanding of requirements documentation. </w:t>
             </w:r>
           </w:p>
         </w:tc>
@@ -1252,6 +1330,7 @@
           </w:tcPr>
           <w:p>
             <w:r>
+              <w:lastRenderedPageBreak/>
               <w:t>Use of language appropriate to audience, and Spelling &amp; Grammar</w:t>
             </w:r>
           </w:p>
@@ -1391,7 +1470,7 @@
         <w:rPr>
           <w:noProof/>
         </w:rPr>
-        <w:t>04/03/2026</w:t>
+        <w:t>05/03/2026</w:t>
       </w:r>
       <w:r>
         <w:fldChar w:fldCharType="end"/>

</xml_diff>